<commit_message>
tabela do parecer jurídico
</commit_message>
<xml_diff>
--- a/ficha_cadastral_final.docx
+++ b/ficha_cadastral_final.docx
@@ -14,12 +14,12 @@
               <wp:anchor distT="0" distB="0" distL="114300" distR="114300" simplePos="0" relativeHeight="251660288" behindDoc="0" locked="0" layoutInCell="1" allowOverlap="1">
                 <wp:simplePos x="0" y="0"/>
                 <wp:positionH relativeFrom="column">
-                  <wp:posOffset>1514104</wp:posOffset>
+                  <wp:posOffset>1511300</wp:posOffset>
                 </wp:positionH>
                 <wp:positionV relativeFrom="paragraph">
-                  <wp:posOffset>3576625</wp:posOffset>
+                  <wp:posOffset>3576955</wp:posOffset>
                 </wp:positionV>
-                <wp:extent cx="5801096" cy="1270000"/>
+                <wp:extent cx="5080000" cy="1270000"/>
                 <wp:effectExtent l="0" t="0" r="0" b="6350"/>
                 <wp:wrapNone/>
                 <wp:docPr id="5" name="Caixa de Texto 5"/>
@@ -31,7 +31,7 @@
                       <wps:spPr>
                         <a:xfrm>
                           <a:off x="0" y="0"/>
-                          <a:ext cx="5801096" cy="1270000"/>
+                          <a:ext cx="5080000" cy="1270000"/>
                         </a:xfrm>
                         <a:prstGeom prst="rect">
                           <a:avLst/>
@@ -99,9 +99,6 @@
                     </wps:wsp>
                   </a:graphicData>
                 </a:graphic>
-                <wp14:sizeRelH relativeFrom="margin">
-                  <wp14:pctWidth>0</wp14:pctWidth>
-                </wp14:sizeRelH>
               </wp:anchor>
             </w:drawing>
           </mc:Choice>
@@ -111,7 +108,7 @@
                 <v:stroke joinstyle="miter"/>
                 <v:path gradientshapeok="t" o:connecttype="rect"/>
               </v:shapetype>
-              <v:shape id="Caixa de Texto 5" o:spid="_x0000_s1026" type="#_x0000_t202" style="position:absolute;margin-left:119.2pt;margin-top:281.6pt;width:456.8pt;height:100pt;z-index:251660288;visibility:visible;mso-wrap-style:square;mso-width-percent:0;mso-wrap-distance-left:9pt;mso-wrap-distance-top:0;mso-wrap-distance-right:9pt;mso-wrap-distance-bottom:0;mso-position-horizontal:absolute;mso-position-horizontal-relative:text;mso-position-vertical:absolute;mso-position-vertical-relative:text;mso-width-percent:0;mso-width-relative:margin;v-text-anchor:top" o:gfxdata="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" filled="f" stroked="f" strokeweight=".5pt">
+              <v:shape id="Caixa de Texto 5" o:spid="_x0000_s1026" type="#_x0000_t202" style="position:absolute;margin-left:119pt;margin-top:281.65pt;width:400pt;height:100pt;z-index:251660288;visibility:visible;mso-wrap-style:square;mso-wrap-distance-left:9pt;mso-wrap-distance-top:0;mso-wrap-distance-right:9pt;mso-wrap-distance-bottom:0;mso-position-horizontal:absolute;mso-position-horizontal-relative:text;mso-position-vertical:absolute;mso-position-vertical-relative:text;v-text-anchor:top" o:gfxdata="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" filled="f" stroked="f" strokeweight=".5pt">
                 <v:textbox>
                   <w:txbxContent>
                     <w:p>
@@ -219,8 +216,6 @@
       <w:r>
         <w:br w:type="page"/>
       </w:r>
-      <w:bookmarkStart w:id="0" w:name="_GoBack"/>
-      <w:bookmarkEnd w:id="0"/>
     </w:p>
     <w:tbl>
       <w:tblPr>
@@ -922,23 +917,31 @@
     <w:tbl>
       <w:tblPr>
         <w:tblStyle w:val="Tabelacomgrade"/>
-        <w:tblW w:w="0" w:type="auto"/>
+        <w:tblW w:w="10881" w:type="dxa"/>
         <w:tblLook w:val="04A0" w:firstRow="1" w:lastRow="0" w:firstColumn="1" w:lastColumn="0" w:noHBand="0" w:noVBand="1"/>
       </w:tblPr>
       <w:tblGrid>
-        <w:gridCol w:w="1411"/>
+        <w:gridCol w:w="1809"/>
+        <w:gridCol w:w="319"/>
         <w:gridCol w:w="227"/>
-        <w:gridCol w:w="1504"/>
+        <w:gridCol w:w="9"/>
+        <w:gridCol w:w="1218"/>
         <w:gridCol w:w="227"/>
-        <w:gridCol w:w="1457"/>
+        <w:gridCol w:w="9"/>
+        <w:gridCol w:w="268"/>
+        <w:gridCol w:w="1026"/>
         <w:gridCol w:w="227"/>
-        <w:gridCol w:w="1248"/>
-        <w:gridCol w:w="726"/>
-        <w:gridCol w:w="1407"/>
+        <w:gridCol w:w="1451"/>
+        <w:gridCol w:w="9"/>
+        <w:gridCol w:w="245"/>
+        <w:gridCol w:w="253"/>
+        <w:gridCol w:w="1283"/>
         <w:gridCol w:w="227"/>
-        <w:gridCol w:w="1402"/>
-        <w:gridCol w:w="227"/>
-        <w:gridCol w:w="726"/>
+        <w:gridCol w:w="226"/>
+        <w:gridCol w:w="1048"/>
+        <w:gridCol w:w="9"/>
+        <w:gridCol w:w="217"/>
+        <w:gridCol w:w="574"/>
       </w:tblGrid>
       <w:tr>
         <w:trPr>
@@ -946,8 +949,8 @@
         </w:trPr>
         <w:tc>
           <w:tcPr>
-            <w:tcW w:w="10794" w:type="dxa"/>
-            <w:gridSpan w:val="13"/>
+            <w:tcW w:w="10881" w:type="dxa"/>
+            <w:gridSpan w:val="21"/>
             <w:tcBorders>
               <w:top w:val="single" w:sz="4" w:space="0" w:color="000000"/>
               <w:left w:val="single" w:sz="4" w:space="0" w:color="000000"/>
@@ -972,7 +975,7 @@
         </w:trPr>
         <w:tc>
           <w:tcPr>
-            <w:tcW w:w="1134" w:type="dxa"/>
+            <w:tcW w:w="2128" w:type="dxa"/>
             <w:gridSpan w:val="2"/>
             <w:tcBorders>
               <w:top w:val="nil"/>
@@ -993,7 +996,8 @@
         </w:tc>
         <w:tc>
           <w:tcPr>
-            <w:tcW w:w="1531" w:type="dxa"/>
+            <w:tcW w:w="1454" w:type="dxa"/>
+            <w:gridSpan w:val="3"/>
             <w:tcBorders>
               <w:top w:val="single" w:sz="4" w:space="0" w:color="000000"/>
               <w:left w:val="single" w:sz="4" w:space="0" w:color="000000"/>
@@ -1016,8 +1020,8 @@
         </w:tc>
         <w:tc>
           <w:tcPr>
-            <w:tcW w:w="2608" w:type="dxa"/>
-            <w:gridSpan w:val="5"/>
+            <w:tcW w:w="3715" w:type="dxa"/>
+            <w:gridSpan w:val="9"/>
             <w:tcBorders>
               <w:top w:val="nil"/>
               <w:left w:val="single" w:sz="4" w:space="0" w:color="000000"/>
@@ -1040,7 +1044,7 @@
         </w:tc>
         <w:tc>
           <w:tcPr>
-            <w:tcW w:w="1531" w:type="dxa"/>
+            <w:tcW w:w="1510" w:type="dxa"/>
             <w:gridSpan w:val="2"/>
             <w:tcBorders>
               <w:top w:val="single" w:sz="4" w:space="0" w:color="000000"/>
@@ -1064,8 +1068,8 @@
         </w:tc>
         <w:tc>
           <w:tcPr>
-            <w:tcW w:w="567" w:type="dxa"/>
-            <w:gridSpan w:val="3"/>
+            <w:tcW w:w="2074" w:type="dxa"/>
+            <w:gridSpan w:val="5"/>
             <w:tcBorders>
               <w:top w:val="nil"/>
               <w:left w:val="single" w:sz="4" w:space="0" w:color="000000"/>
@@ -1086,8 +1090,8 @@
         </w:trPr>
         <w:tc>
           <w:tcPr>
-            <w:tcW w:w="10794" w:type="dxa"/>
-            <w:gridSpan w:val="13"/>
+            <w:tcW w:w="10881" w:type="dxa"/>
+            <w:gridSpan w:val="21"/>
             <w:tcBorders>
               <w:top w:val="nil"/>
               <w:left w:val="single" w:sz="4" w:space="0" w:color="000000"/>
@@ -1112,7 +1116,7 @@
         </w:trPr>
         <w:tc>
           <w:tcPr>
-            <w:tcW w:w="1474" w:type="dxa"/>
+            <w:tcW w:w="1809" w:type="dxa"/>
             <w:tcBorders>
               <w:top w:val="nil"/>
               <w:left w:val="single" w:sz="4" w:space="0" w:color="000000"/>
@@ -1134,7 +1138,7 @@
         </w:tc>
         <w:tc>
           <w:tcPr>
-            <w:tcW w:w="227" w:type="dxa"/>
+            <w:tcW w:w="319" w:type="dxa"/>
             <w:tcBorders>
               <w:top w:val="single" w:sz="4" w:space="0" w:color="000000"/>
               <w:left w:val="single" w:sz="4" w:space="0" w:color="000000"/>
@@ -1156,7 +1160,8 @@
         </w:tc>
         <w:tc>
           <w:tcPr>
-            <w:tcW w:w="1474" w:type="dxa"/>
+            <w:tcW w:w="1454" w:type="dxa"/>
+            <w:gridSpan w:val="3"/>
             <w:tcBorders>
               <w:top w:val="nil"/>
               <w:left w:val="single" w:sz="4" w:space="0" w:color="000000"/>
@@ -1200,7 +1205,8 @@
         </w:tc>
         <w:tc>
           <w:tcPr>
-            <w:tcW w:w="1542" w:type="dxa"/>
+            <w:tcW w:w="1303" w:type="dxa"/>
+            <w:gridSpan w:val="3"/>
             <w:tcBorders>
               <w:top w:val="nil"/>
               <w:left w:val="single" w:sz="4" w:space="0" w:color="000000"/>
@@ -1244,7 +1250,8 @@
         </w:tc>
         <w:tc>
           <w:tcPr>
-            <w:tcW w:w="1247" w:type="dxa"/>
+            <w:tcW w:w="1705" w:type="dxa"/>
+            <w:gridSpan w:val="3"/>
             <w:tcBorders>
               <w:top w:val="nil"/>
               <w:left w:val="single" w:sz="4" w:space="0" w:color="000000"/>
@@ -1266,7 +1273,7 @@
         </w:tc>
         <w:tc>
           <w:tcPr>
-            <w:tcW w:w="227" w:type="dxa"/>
+            <w:tcW w:w="253" w:type="dxa"/>
             <w:tcBorders>
               <w:top w:val="single" w:sz="4" w:space="0" w:color="000000"/>
               <w:left w:val="single" w:sz="4" w:space="0" w:color="000000"/>
@@ -1288,7 +1295,7 @@
         </w:tc>
         <w:tc>
           <w:tcPr>
-            <w:tcW w:w="1474" w:type="dxa"/>
+            <w:tcW w:w="1283" w:type="dxa"/>
             <w:tcBorders>
               <w:top w:val="nil"/>
               <w:left w:val="single" w:sz="4" w:space="0" w:color="000000"/>
@@ -1332,7 +1339,8 @@
         </w:tc>
         <w:tc>
           <w:tcPr>
-            <w:tcW w:w="1474" w:type="dxa"/>
+            <w:tcW w:w="1274" w:type="dxa"/>
+            <w:gridSpan w:val="2"/>
             <w:tcBorders>
               <w:top w:val="nil"/>
               <w:left w:val="single" w:sz="4" w:space="0" w:color="000000"/>
@@ -1354,7 +1362,8 @@
         </w:tc>
         <w:tc>
           <w:tcPr>
-            <w:tcW w:w="227" w:type="dxa"/>
+            <w:tcW w:w="226" w:type="dxa"/>
+            <w:gridSpan w:val="2"/>
             <w:tcBorders>
               <w:top w:val="single" w:sz="4" w:space="0" w:color="000000"/>
               <w:left w:val="single" w:sz="4" w:space="0" w:color="000000"/>
@@ -1376,7 +1385,7 @@
         </w:tc>
         <w:tc>
           <w:tcPr>
-            <w:tcW w:w="680" w:type="dxa"/>
+            <w:tcW w:w="574" w:type="dxa"/>
             <w:tcBorders>
               <w:top w:val="nil"/>
               <w:left w:val="nil"/>
@@ -1403,8 +1412,8 @@
         </w:trPr>
         <w:tc>
           <w:tcPr>
-            <w:tcW w:w="10794" w:type="dxa"/>
-            <w:gridSpan w:val="13"/>
+            <w:tcW w:w="10881" w:type="dxa"/>
+            <w:gridSpan w:val="21"/>
             <w:tcBorders>
               <w:top w:val="nil"/>
               <w:left w:val="single" w:sz="4" w:space="0" w:color="000000"/>
@@ -1431,7 +1440,7 @@
         </w:trPr>
         <w:tc>
           <w:tcPr>
-            <w:tcW w:w="1474" w:type="dxa"/>
+            <w:tcW w:w="1809" w:type="dxa"/>
             <w:tcBorders>
               <w:top w:val="nil"/>
               <w:left w:val="single" w:sz="4" w:space="0" w:color="000000"/>
@@ -1453,7 +1462,7 @@
         </w:tc>
         <w:tc>
           <w:tcPr>
-            <w:tcW w:w="227" w:type="dxa"/>
+            <w:tcW w:w="319" w:type="dxa"/>
             <w:tcBorders>
               <w:top w:val="single" w:sz="4" w:space="0" w:color="000000"/>
               <w:left w:val="single" w:sz="4" w:space="0" w:color="000000"/>
@@ -1475,7 +1484,8 @@
         </w:tc>
         <w:tc>
           <w:tcPr>
-            <w:tcW w:w="1474" w:type="dxa"/>
+            <w:tcW w:w="1454" w:type="dxa"/>
+            <w:gridSpan w:val="3"/>
             <w:tcBorders>
               <w:top w:val="nil"/>
               <w:left w:val="single" w:sz="4" w:space="0" w:color="000000"/>
@@ -1519,7 +1529,8 @@
         </w:tc>
         <w:tc>
           <w:tcPr>
-            <w:tcW w:w="1542" w:type="dxa"/>
+            <w:tcW w:w="1303" w:type="dxa"/>
+            <w:gridSpan w:val="3"/>
             <w:tcBorders>
               <w:top w:val="nil"/>
               <w:left w:val="single" w:sz="4" w:space="0" w:color="000000"/>
@@ -1563,7 +1574,8 @@
         </w:tc>
         <w:tc>
           <w:tcPr>
-            <w:tcW w:w="1247" w:type="dxa"/>
+            <w:tcW w:w="1705" w:type="dxa"/>
+            <w:gridSpan w:val="3"/>
             <w:tcBorders>
               <w:top w:val="nil"/>
               <w:left w:val="single" w:sz="4" w:space="0" w:color="000000"/>
@@ -1585,7 +1597,7 @@
         </w:tc>
         <w:tc>
           <w:tcPr>
-            <w:tcW w:w="227" w:type="dxa"/>
+            <w:tcW w:w="253" w:type="dxa"/>
             <w:tcBorders>
               <w:top w:val="single" w:sz="4" w:space="0" w:color="000000"/>
               <w:left w:val="single" w:sz="4" w:space="0" w:color="000000"/>
@@ -1607,7 +1619,7 @@
         </w:tc>
         <w:tc>
           <w:tcPr>
-            <w:tcW w:w="1474" w:type="dxa"/>
+            <w:tcW w:w="1283" w:type="dxa"/>
             <w:tcBorders>
               <w:top w:val="nil"/>
               <w:left w:val="single" w:sz="4" w:space="0" w:color="000000"/>
@@ -1651,7 +1663,8 @@
         </w:tc>
         <w:tc>
           <w:tcPr>
-            <w:tcW w:w="1474" w:type="dxa"/>
+            <w:tcW w:w="1274" w:type="dxa"/>
+            <w:gridSpan w:val="2"/>
             <w:tcBorders>
               <w:top w:val="nil"/>
               <w:left w:val="single" w:sz="4" w:space="0" w:color="000000"/>
@@ -1673,7 +1686,8 @@
         </w:tc>
         <w:tc>
           <w:tcPr>
-            <w:tcW w:w="227" w:type="dxa"/>
+            <w:tcW w:w="226" w:type="dxa"/>
+            <w:gridSpan w:val="2"/>
             <w:tcBorders>
               <w:top w:val="single" w:sz="4" w:space="0" w:color="000000"/>
               <w:left w:val="single" w:sz="4" w:space="0" w:color="000000"/>
@@ -1695,7 +1709,7 @@
         </w:tc>
         <w:tc>
           <w:tcPr>
-            <w:tcW w:w="680" w:type="dxa"/>
+            <w:tcW w:w="574" w:type="dxa"/>
             <w:tcBorders>
               <w:top w:val="nil"/>
               <w:left w:val="nil"/>
@@ -1722,8 +1736,8 @@
         </w:trPr>
         <w:tc>
           <w:tcPr>
-            <w:tcW w:w="10794" w:type="dxa"/>
-            <w:gridSpan w:val="13"/>
+            <w:tcW w:w="10881" w:type="dxa"/>
+            <w:gridSpan w:val="21"/>
             <w:tcBorders>
               <w:top w:val="single" w:sz="4" w:space="0" w:color="000000"/>
               <w:left w:val="single" w:sz="4" w:space="0" w:color="000000"/>
@@ -1747,8 +1761,8 @@
         </w:trPr>
         <w:tc>
           <w:tcPr>
-            <w:tcW w:w="2313" w:type="dxa"/>
-            <w:gridSpan w:val="3"/>
+            <w:tcW w:w="3582" w:type="dxa"/>
+            <w:gridSpan w:val="5"/>
             <w:tcBorders>
               <w:top w:val="nil"/>
               <w:left w:val="single" w:sz="4" w:space="0" w:color="000000"/>
@@ -1792,8 +1806,8 @@
         </w:tc>
         <w:tc>
           <w:tcPr>
-            <w:tcW w:w="3084" w:type="dxa"/>
-            <w:gridSpan w:val="3"/>
+            <w:tcW w:w="3235" w:type="dxa"/>
+            <w:gridSpan w:val="7"/>
             <w:tcBorders>
               <w:top w:val="nil"/>
               <w:left w:val="single" w:sz="4" w:space="0" w:color="000000"/>
@@ -1815,7 +1829,7 @@
         </w:tc>
         <w:tc>
           <w:tcPr>
-            <w:tcW w:w="771" w:type="dxa"/>
+            <w:tcW w:w="253" w:type="dxa"/>
             <w:tcBorders>
               <w:top w:val="single" w:sz="4" w:space="0" w:color="000000"/>
               <w:left w:val="single" w:sz="4" w:space="0" w:color="000000"/>
@@ -1837,8 +1851,8 @@
         </w:tc>
         <w:tc>
           <w:tcPr>
-            <w:tcW w:w="2313" w:type="dxa"/>
-            <w:gridSpan w:val="3"/>
+            <w:tcW w:w="2784" w:type="dxa"/>
+            <w:gridSpan w:val="4"/>
             <w:tcBorders>
               <w:top w:val="nil"/>
               <w:left w:val="single" w:sz="4" w:space="0" w:color="000000"/>
@@ -1860,7 +1874,8 @@
         </w:tc>
         <w:tc>
           <w:tcPr>
-            <w:tcW w:w="227" w:type="dxa"/>
+            <w:tcW w:w="226" w:type="dxa"/>
+            <w:gridSpan w:val="2"/>
             <w:tcBorders>
               <w:top w:val="single" w:sz="4" w:space="0" w:color="000000"/>
               <w:left w:val="single" w:sz="4" w:space="0" w:color="000000"/>
@@ -1882,7 +1897,7 @@
         </w:tc>
         <w:tc>
           <w:tcPr>
-            <w:tcW w:w="771" w:type="dxa"/>
+            <w:tcW w:w="574" w:type="dxa"/>
             <w:tcBorders>
               <w:top w:val="nil"/>
               <w:left w:val="single" w:sz="4" w:space="0" w:color="000000"/>
@@ -1909,8 +1924,8 @@
         </w:trPr>
         <w:tc>
           <w:tcPr>
-            <w:tcW w:w="10206" w:type="dxa"/>
-            <w:gridSpan w:val="13"/>
+            <w:tcW w:w="10881" w:type="dxa"/>
+            <w:gridSpan w:val="21"/>
             <w:tcBorders>
               <w:top w:val="nil"/>
               <w:left w:val="single" w:sz="4" w:space="0" w:color="000000"/>
@@ -1931,8 +1946,1549 @@
           </w:p>
         </w:tc>
       </w:tr>
+      <w:tr>
+        <w:tc>
+          <w:tcPr>
+            <w:tcW w:w="10881" w:type="dxa"/>
+            <w:gridSpan w:val="21"/>
+            <w:tcBorders>
+              <w:top w:val="single" w:sz="4" w:space="0" w:color="000000"/>
+              <w:left w:val="single" w:sz="4" w:space="0" w:color="000000"/>
+              <w:bottom w:val="single" w:sz="4" w:space="0" w:color="000000"/>
+              <w:right w:val="single" w:sz="4" w:space="0" w:color="000000"/>
+            </w:tcBorders>
+            <w:shd w:val="clear" w:color="auto" w:fill="4EA65D"/>
+          </w:tcPr>
+          <w:p>
+            <w:pPr>
+              <w:jc w:val="center"/>
+            </w:pPr>
+            <w:r>
+              <w:rPr>
+                <w:b/>
+                <w:sz w:val="24"/>
+                <w:lang w:val="pt-BR"/>
+              </w:rPr>
+              <w:lastRenderedPageBreak/>
+              <w:t>Parecer Jurídico-ambiental</w:t>
+            </w:r>
+          </w:p>
+        </w:tc>
+      </w:tr>
+      <w:tr>
+        <w:trPr>
+          <w:trHeight w:val="283"/>
+        </w:trPr>
+        <w:tc>
+          <w:tcPr>
+            <w:tcW w:w="10881" w:type="dxa"/>
+            <w:gridSpan w:val="21"/>
+            <w:tcBorders>
+              <w:top w:val="single" w:sz="4" w:space="0" w:color="000000"/>
+              <w:left w:val="single" w:sz="4" w:space="0" w:color="000000"/>
+              <w:bottom w:val="nil"/>
+              <w:right w:val="single" w:sz="4" w:space="0" w:color="000000"/>
+            </w:tcBorders>
+          </w:tcPr>
+          <w:p>
+            <w:proofErr w:type="spellStart"/>
+            <w:r>
+              <w:rPr>
+                <w:b/>
+                <w:sz w:val="24"/>
+              </w:rPr>
+              <w:t>Poss</w:t>
+            </w:r>
+            <w:bookmarkStart w:id="0" w:name="_GoBack"/>
+            <w:bookmarkEnd w:id="0"/>
+            <w:r>
+              <w:rPr>
+                <w:b/>
+                <w:sz w:val="24"/>
+              </w:rPr>
+              <w:t>ui</w:t>
+            </w:r>
+            <w:proofErr w:type="spellEnd"/>
+            <w:r>
+              <w:rPr>
+                <w:b/>
+                <w:sz w:val="24"/>
+              </w:rPr>
+              <w:t xml:space="preserve"> </w:t>
+            </w:r>
+            <w:proofErr w:type="spellStart"/>
+            <w:r>
+              <w:rPr>
+                <w:b/>
+                <w:sz w:val="24"/>
+              </w:rPr>
+              <w:t>Georreferenciamento</w:t>
+            </w:r>
+            <w:proofErr w:type="spellEnd"/>
+            <w:r>
+              <w:rPr>
+                <w:b/>
+                <w:sz w:val="24"/>
+              </w:rPr>
+              <w:t>?</w:t>
+            </w:r>
+          </w:p>
+        </w:tc>
+      </w:tr>
+      <w:tr>
+        <w:trPr>
+          <w:trHeight w:val="283"/>
+        </w:trPr>
+        <w:tc>
+          <w:tcPr>
+            <w:tcW w:w="2128" w:type="dxa"/>
+            <w:gridSpan w:val="2"/>
+            <w:tcBorders>
+              <w:top w:val="nil"/>
+              <w:left w:val="single" w:sz="4" w:space="0" w:color="000000"/>
+              <w:bottom w:val="nil"/>
+              <w:right w:val="single" w:sz="4" w:space="0" w:color="000000"/>
+            </w:tcBorders>
+          </w:tcPr>
+          <w:p>
+            <w:pPr>
+              <w:jc w:val="center"/>
+            </w:pPr>
+            <w:r>
+              <w:t>Sim</w:t>
+            </w:r>
+          </w:p>
+        </w:tc>
+        <w:tc>
+          <w:tcPr>
+            <w:tcW w:w="236" w:type="dxa"/>
+            <w:gridSpan w:val="2"/>
+            <w:tcBorders>
+              <w:top w:val="single" w:sz="4" w:space="0" w:color="000000"/>
+              <w:left w:val="single" w:sz="4" w:space="0" w:color="000000"/>
+              <w:bottom w:val="single" w:sz="4" w:space="0" w:color="000000"/>
+              <w:right w:val="single" w:sz="4" w:space="0" w:color="000000"/>
+            </w:tcBorders>
+          </w:tcPr>
+          <w:p>
+            <w:pPr>
+              <w:jc w:val="center"/>
+            </w:pPr>
+            <w:r>
+              <w:rPr>
+                <w:sz w:val="24"/>
+              </w:rPr>
+              <w:t xml:space="preserve"> </w:t>
+            </w:r>
+          </w:p>
+        </w:tc>
+        <w:tc>
+          <w:tcPr>
+            <w:tcW w:w="1454" w:type="dxa"/>
+            <w:gridSpan w:val="3"/>
+            <w:tcBorders>
+              <w:top w:val="nil"/>
+              <w:left w:val="single" w:sz="4" w:space="0" w:color="000000"/>
+              <w:bottom w:val="nil"/>
+              <w:right w:val="single" w:sz="4" w:space="0" w:color="000000"/>
+            </w:tcBorders>
+          </w:tcPr>
+          <w:p>
+            <w:pPr>
+              <w:jc w:val="center"/>
+            </w:pPr>
+            <w:proofErr w:type="spellStart"/>
+            <w:r>
+              <w:rPr>
+                <w:sz w:val="24"/>
+              </w:rPr>
+              <w:t>Não</w:t>
+            </w:r>
+            <w:proofErr w:type="spellEnd"/>
+          </w:p>
+        </w:tc>
+        <w:tc>
+          <w:tcPr>
+            <w:tcW w:w="268" w:type="dxa"/>
+            <w:tcBorders>
+              <w:top w:val="single" w:sz="4" w:space="0" w:color="000000"/>
+              <w:left w:val="single" w:sz="4" w:space="0" w:color="000000"/>
+              <w:bottom w:val="single" w:sz="4" w:space="0" w:color="000000"/>
+              <w:right w:val="single" w:sz="4" w:space="0" w:color="000000"/>
+            </w:tcBorders>
+          </w:tcPr>
+          <w:p>
+            <w:pPr>
+              <w:jc w:val="center"/>
+            </w:pPr>
+            <w:r>
+              <w:rPr>
+                <w:sz w:val="24"/>
+              </w:rPr>
+              <w:t xml:space="preserve"> </w:t>
+            </w:r>
+          </w:p>
+        </w:tc>
+        <w:tc>
+          <w:tcPr>
+            <w:tcW w:w="2713" w:type="dxa"/>
+            <w:gridSpan w:val="4"/>
+            <w:tcBorders>
+              <w:top w:val="nil"/>
+              <w:left w:val="single" w:sz="4" w:space="0" w:color="000000"/>
+              <w:bottom w:val="nil"/>
+              <w:right w:val="single" w:sz="4" w:space="0" w:color="000000"/>
+            </w:tcBorders>
+          </w:tcPr>
+          <w:p>
+            <w:pPr>
+              <w:jc w:val="center"/>
+            </w:pPr>
+            <w:proofErr w:type="spellStart"/>
+            <w:r>
+              <w:rPr>
+                <w:sz w:val="24"/>
+              </w:rPr>
+              <w:t>Código</w:t>
+            </w:r>
+            <w:proofErr w:type="spellEnd"/>
+            <w:r>
+              <w:rPr>
+                <w:sz w:val="24"/>
+              </w:rPr>
+              <w:t xml:space="preserve"> Geo</w:t>
+            </w:r>
+          </w:p>
+        </w:tc>
+        <w:tc>
+          <w:tcPr>
+            <w:tcW w:w="3291" w:type="dxa"/>
+            <w:gridSpan w:val="7"/>
+            <w:tcBorders>
+              <w:top w:val="single" w:sz="4" w:space="0" w:color="000000"/>
+              <w:left w:val="single" w:sz="4" w:space="0" w:color="000000"/>
+              <w:bottom w:val="single" w:sz="4" w:space="0" w:color="000000"/>
+              <w:right w:val="single" w:sz="4" w:space="0" w:color="000000"/>
+            </w:tcBorders>
+          </w:tcPr>
+          <w:p>
+            <w:pPr>
+              <w:jc w:val="center"/>
+            </w:pPr>
+            <w:r>
+              <w:rPr>
+                <w:sz w:val="24"/>
+              </w:rPr>
+              <w:t xml:space="preserve"> </w:t>
+            </w:r>
+          </w:p>
+        </w:tc>
+        <w:tc>
+          <w:tcPr>
+            <w:tcW w:w="791" w:type="dxa"/>
+            <w:gridSpan w:val="2"/>
+            <w:tcBorders>
+              <w:top w:val="nil"/>
+              <w:left w:val="single" w:sz="4" w:space="0" w:color="000000"/>
+              <w:bottom w:val="nil"/>
+              <w:right w:val="single" w:sz="4" w:space="0" w:color="000000"/>
+            </w:tcBorders>
+          </w:tcPr>
+          <w:p>
+            <w:pPr>
+              <w:jc w:val="center"/>
+            </w:pPr>
+            <w:r>
+              <w:rPr>
+                <w:sz w:val="24"/>
+              </w:rPr>
+              <w:t xml:space="preserve"> </w:t>
+            </w:r>
+          </w:p>
+        </w:tc>
+      </w:tr>
+      <w:tr>
+        <w:trPr>
+          <w:trHeight w:val="57"/>
+        </w:trPr>
+        <w:tc>
+          <w:tcPr>
+            <w:tcW w:w="10881" w:type="dxa"/>
+            <w:gridSpan w:val="21"/>
+            <w:tcBorders>
+              <w:top w:val="nil"/>
+              <w:left w:val="single" w:sz="4" w:space="0" w:color="000000"/>
+              <w:bottom w:val="nil"/>
+              <w:right w:val="single" w:sz="4" w:space="0" w:color="000000"/>
+            </w:tcBorders>
+          </w:tcPr>
+          <w:p>
+            <w:pPr>
+              <w:jc w:val="right"/>
+            </w:pPr>
+            <w:r>
+              <w:rPr>
+                <w:sz w:val="2"/>
+              </w:rPr>
+              <w:t xml:space="preserve"> </w:t>
+            </w:r>
+          </w:p>
+        </w:tc>
+      </w:tr>
+      <w:tr>
+        <w:trPr>
+          <w:trHeight w:val="283"/>
+        </w:trPr>
+        <w:tc>
+          <w:tcPr>
+            <w:tcW w:w="2128" w:type="dxa"/>
+            <w:gridSpan w:val="2"/>
+            <w:tcBorders>
+              <w:top w:val="nil"/>
+              <w:left w:val="single" w:sz="4" w:space="0" w:color="000000"/>
+              <w:bottom w:val="nil"/>
+              <w:right w:val="single" w:sz="4" w:space="0" w:color="000000"/>
+            </w:tcBorders>
+            <w:vAlign w:val="center"/>
+          </w:tcPr>
+          <w:p>
+            <w:pPr>
+              <w:jc w:val="center"/>
+            </w:pPr>
+            <w:r>
+              <w:rPr>
+                <w:sz w:val="24"/>
+              </w:rPr>
+              <w:t>CAR</w:t>
+            </w:r>
+          </w:p>
+        </w:tc>
+        <w:tc>
+          <w:tcPr>
+            <w:tcW w:w="6905" w:type="dxa"/>
+            <w:gridSpan w:val="15"/>
+            <w:tcBorders>
+              <w:top w:val="single" w:sz="4" w:space="0" w:color="000000"/>
+              <w:left w:val="single" w:sz="4" w:space="0" w:color="000000"/>
+              <w:bottom w:val="single" w:sz="4" w:space="0" w:color="000000"/>
+              <w:right w:val="single" w:sz="4" w:space="0" w:color="000000"/>
+            </w:tcBorders>
+          </w:tcPr>
+          <w:p>
+            <w:pPr>
+              <w:jc w:val="center"/>
+            </w:pPr>
+            <w:r>
+              <w:rPr>
+                <w:sz w:val="24"/>
+              </w:rPr>
+              <w:t xml:space="preserve"> </w:t>
+            </w:r>
+          </w:p>
+        </w:tc>
+        <w:tc>
+          <w:tcPr>
+            <w:tcW w:w="1848" w:type="dxa"/>
+            <w:gridSpan w:val="4"/>
+            <w:tcBorders>
+              <w:top w:val="nil"/>
+              <w:left w:val="single" w:sz="4" w:space="0" w:color="000000"/>
+              <w:bottom w:val="nil"/>
+              <w:right w:val="single" w:sz="4" w:space="0" w:color="000000"/>
+            </w:tcBorders>
+          </w:tcPr>
+          <w:p>
+            <w:pPr>
+              <w:jc w:val="center"/>
+            </w:pPr>
+            <w:r>
+              <w:rPr>
+                <w:sz w:val="24"/>
+              </w:rPr>
+              <w:t xml:space="preserve"> </w:t>
+            </w:r>
+          </w:p>
+        </w:tc>
+      </w:tr>
+      <w:tr>
+        <w:trPr>
+          <w:trHeight w:val="57"/>
+        </w:trPr>
+        <w:tc>
+          <w:tcPr>
+            <w:tcW w:w="10881" w:type="dxa"/>
+            <w:gridSpan w:val="21"/>
+            <w:tcBorders>
+              <w:top w:val="nil"/>
+              <w:left w:val="single" w:sz="4" w:space="0" w:color="000000"/>
+              <w:bottom w:val="nil"/>
+              <w:right w:val="single" w:sz="4" w:space="0" w:color="000000"/>
+            </w:tcBorders>
+          </w:tcPr>
+          <w:p>
+            <w:pPr>
+              <w:jc w:val="right"/>
+            </w:pPr>
+            <w:r>
+              <w:rPr>
+                <w:sz w:val="6"/>
+              </w:rPr>
+              <w:t xml:space="preserve">  </w:t>
+            </w:r>
+          </w:p>
+        </w:tc>
+      </w:tr>
+      <w:tr>
+        <w:trPr>
+          <w:trHeight w:val="283"/>
+        </w:trPr>
+        <w:tc>
+          <w:tcPr>
+            <w:tcW w:w="2355" w:type="dxa"/>
+            <w:gridSpan w:val="3"/>
+            <w:tcBorders>
+              <w:top w:val="nil"/>
+              <w:left w:val="single" w:sz="4" w:space="0" w:color="000000"/>
+              <w:bottom w:val="nil"/>
+              <w:right w:val="single" w:sz="4" w:space="0" w:color="000000"/>
+            </w:tcBorders>
+          </w:tcPr>
+          <w:p>
+            <w:proofErr w:type="spellStart"/>
+            <w:r>
+              <w:rPr>
+                <w:sz w:val="24"/>
+              </w:rPr>
+              <w:t>Proprietários</w:t>
+            </w:r>
+            <w:proofErr w:type="spellEnd"/>
+            <w:r>
+              <w:rPr>
+                <w:sz w:val="24"/>
+              </w:rPr>
+              <w:t>(s)</w:t>
+            </w:r>
+          </w:p>
+        </w:tc>
+        <w:tc>
+          <w:tcPr>
+            <w:tcW w:w="2984" w:type="dxa"/>
+            <w:gridSpan w:val="7"/>
+            <w:tcBorders>
+              <w:top w:val="single" w:sz="4" w:space="0" w:color="000000"/>
+              <w:left w:val="single" w:sz="4" w:space="0" w:color="000000"/>
+              <w:bottom w:val="single" w:sz="4" w:space="0" w:color="000000"/>
+              <w:right w:val="single" w:sz="4" w:space="0" w:color="000000"/>
+            </w:tcBorders>
+          </w:tcPr>
+          <w:p>
+            <w:pPr>
+              <w:jc w:val="center"/>
+            </w:pPr>
+            <w:r>
+              <w:rPr>
+                <w:sz w:val="24"/>
+              </w:rPr>
+              <w:t xml:space="preserve"> </w:t>
+            </w:r>
+          </w:p>
+        </w:tc>
+        <w:tc>
+          <w:tcPr>
+            <w:tcW w:w="1451" w:type="dxa"/>
+            <w:tcBorders>
+              <w:top w:val="nil"/>
+              <w:left w:val="single" w:sz="4" w:space="0" w:color="000000"/>
+              <w:bottom w:val="nil"/>
+              <w:right w:val="single" w:sz="4" w:space="0" w:color="000000"/>
+            </w:tcBorders>
+          </w:tcPr>
+          <w:p>
+            <w:pPr>
+              <w:jc w:val="center"/>
+            </w:pPr>
+            <w:r>
+              <w:rPr>
+                <w:b/>
+                <w:sz w:val="24"/>
+              </w:rPr>
+              <w:t>CPF</w:t>
+            </w:r>
+          </w:p>
+        </w:tc>
+        <w:tc>
+          <w:tcPr>
+            <w:tcW w:w="3291" w:type="dxa"/>
+            <w:gridSpan w:val="7"/>
+            <w:tcBorders>
+              <w:top w:val="single" w:sz="4" w:space="0" w:color="000000"/>
+              <w:left w:val="single" w:sz="4" w:space="0" w:color="000000"/>
+              <w:bottom w:val="single" w:sz="4" w:space="0" w:color="000000"/>
+              <w:right w:val="single" w:sz="4" w:space="0" w:color="000000"/>
+            </w:tcBorders>
+          </w:tcPr>
+          <w:p>
+            <w:pPr>
+              <w:jc w:val="center"/>
+            </w:pPr>
+            <w:r>
+              <w:rPr>
+                <w:sz w:val="24"/>
+              </w:rPr>
+              <w:t xml:space="preserve"> </w:t>
+            </w:r>
+          </w:p>
+        </w:tc>
+        <w:tc>
+          <w:tcPr>
+            <w:tcW w:w="800" w:type="dxa"/>
+            <w:gridSpan w:val="3"/>
+            <w:tcBorders>
+              <w:top w:val="nil"/>
+              <w:left w:val="single" w:sz="4" w:space="0" w:color="000000"/>
+              <w:bottom w:val="nil"/>
+              <w:right w:val="single" w:sz="4" w:space="0" w:color="000000"/>
+            </w:tcBorders>
+          </w:tcPr>
+          <w:p>
+            <w:pPr>
+              <w:jc w:val="center"/>
+            </w:pPr>
+            <w:r>
+              <w:rPr>
+                <w:sz w:val="24"/>
+              </w:rPr>
+              <w:t xml:space="preserve"> </w:t>
+            </w:r>
+          </w:p>
+        </w:tc>
+      </w:tr>
+      <w:tr>
+        <w:trPr>
+          <w:trHeight w:val="510"/>
+        </w:trPr>
+        <w:tc>
+          <w:tcPr>
+            <w:tcW w:w="10881" w:type="dxa"/>
+            <w:gridSpan w:val="21"/>
+            <w:tcBorders>
+              <w:top w:val="nil"/>
+              <w:left w:val="single" w:sz="4" w:space="0" w:color="000000"/>
+              <w:bottom w:val="nil"/>
+              <w:right w:val="single" w:sz="4" w:space="0" w:color="000000"/>
+            </w:tcBorders>
+          </w:tcPr>
+          <w:p>
+            <w:proofErr w:type="spellStart"/>
+            <w:r>
+              <w:rPr>
+                <w:b/>
+                <w:sz w:val="24"/>
+              </w:rPr>
+              <w:t>Possui</w:t>
+            </w:r>
+            <w:proofErr w:type="spellEnd"/>
+            <w:r>
+              <w:rPr>
+                <w:b/>
+                <w:sz w:val="24"/>
+              </w:rPr>
+              <w:t xml:space="preserve"> </w:t>
+            </w:r>
+            <w:proofErr w:type="spellStart"/>
+            <w:r>
+              <w:rPr>
+                <w:b/>
+                <w:sz w:val="24"/>
+              </w:rPr>
+              <w:t>Alienação</w:t>
+            </w:r>
+            <w:proofErr w:type="spellEnd"/>
+            <w:r>
+              <w:rPr>
+                <w:b/>
+                <w:sz w:val="24"/>
+              </w:rPr>
+              <w:t xml:space="preserve"> </w:t>
+            </w:r>
+            <w:proofErr w:type="spellStart"/>
+            <w:r>
+              <w:rPr>
+                <w:b/>
+                <w:sz w:val="24"/>
+              </w:rPr>
+              <w:t>Fiduciária</w:t>
+            </w:r>
+            <w:proofErr w:type="spellEnd"/>
+            <w:r>
+              <w:rPr>
+                <w:b/>
+                <w:sz w:val="24"/>
+              </w:rPr>
+              <w:t>?</w:t>
+            </w:r>
+          </w:p>
+        </w:tc>
+      </w:tr>
+      <w:tr>
+        <w:trPr>
+          <w:trHeight w:val="283"/>
+        </w:trPr>
+        <w:tc>
+          <w:tcPr>
+            <w:tcW w:w="2128" w:type="dxa"/>
+            <w:gridSpan w:val="2"/>
+            <w:tcBorders>
+              <w:top w:val="nil"/>
+              <w:left w:val="single" w:sz="4" w:space="0" w:color="000000"/>
+              <w:bottom w:val="nil"/>
+              <w:right w:val="single" w:sz="4" w:space="0" w:color="000000"/>
+            </w:tcBorders>
+          </w:tcPr>
+          <w:p>
+            <w:pPr>
+              <w:jc w:val="center"/>
+            </w:pPr>
+            <w:r>
+              <w:rPr>
+                <w:sz w:val="24"/>
+              </w:rPr>
+              <w:t>Sim</w:t>
+            </w:r>
+          </w:p>
+        </w:tc>
+        <w:tc>
+          <w:tcPr>
+            <w:tcW w:w="236" w:type="dxa"/>
+            <w:gridSpan w:val="2"/>
+            <w:tcBorders>
+              <w:top w:val="single" w:sz="4" w:space="0" w:color="000000"/>
+              <w:left w:val="single" w:sz="4" w:space="0" w:color="000000"/>
+              <w:bottom w:val="single" w:sz="4" w:space="0" w:color="000000"/>
+              <w:right w:val="single" w:sz="4" w:space="0" w:color="000000"/>
+            </w:tcBorders>
+          </w:tcPr>
+          <w:p>
+            <w:pPr>
+              <w:jc w:val="center"/>
+            </w:pPr>
+            <w:r>
+              <w:rPr>
+                <w:sz w:val="24"/>
+              </w:rPr>
+              <w:t xml:space="preserve"> </w:t>
+            </w:r>
+          </w:p>
+        </w:tc>
+        <w:tc>
+          <w:tcPr>
+            <w:tcW w:w="1454" w:type="dxa"/>
+            <w:gridSpan w:val="3"/>
+            <w:tcBorders>
+              <w:top w:val="nil"/>
+              <w:left w:val="single" w:sz="4" w:space="0" w:color="000000"/>
+              <w:bottom w:val="nil"/>
+              <w:right w:val="single" w:sz="4" w:space="0" w:color="000000"/>
+            </w:tcBorders>
+          </w:tcPr>
+          <w:p>
+            <w:pPr>
+              <w:jc w:val="center"/>
+            </w:pPr>
+            <w:proofErr w:type="spellStart"/>
+            <w:r>
+              <w:rPr>
+                <w:sz w:val="24"/>
+              </w:rPr>
+              <w:t>Não</w:t>
+            </w:r>
+            <w:proofErr w:type="spellEnd"/>
+          </w:p>
+        </w:tc>
+        <w:tc>
+          <w:tcPr>
+            <w:tcW w:w="268" w:type="dxa"/>
+            <w:tcBorders>
+              <w:top w:val="single" w:sz="4" w:space="0" w:color="000000"/>
+              <w:left w:val="single" w:sz="4" w:space="0" w:color="000000"/>
+              <w:bottom w:val="single" w:sz="4" w:space="0" w:color="000000"/>
+              <w:right w:val="single" w:sz="4" w:space="0" w:color="000000"/>
+            </w:tcBorders>
+          </w:tcPr>
+          <w:p>
+            <w:pPr>
+              <w:jc w:val="center"/>
+            </w:pPr>
+            <w:r>
+              <w:rPr>
+                <w:sz w:val="24"/>
+              </w:rPr>
+              <w:t xml:space="preserve"> </w:t>
+            </w:r>
+          </w:p>
+        </w:tc>
+        <w:tc>
+          <w:tcPr>
+            <w:tcW w:w="6795" w:type="dxa"/>
+            <w:gridSpan w:val="13"/>
+            <w:tcBorders>
+              <w:top w:val="nil"/>
+              <w:left w:val="single" w:sz="4" w:space="0" w:color="000000"/>
+              <w:bottom w:val="nil"/>
+              <w:right w:val="single" w:sz="4" w:space="0" w:color="000000"/>
+            </w:tcBorders>
+          </w:tcPr>
+          <w:p>
+            <w:pPr>
+              <w:jc w:val="center"/>
+            </w:pPr>
+            <w:r>
+              <w:rPr>
+                <w:sz w:val="24"/>
+              </w:rPr>
+              <w:t xml:space="preserve"> </w:t>
+            </w:r>
+          </w:p>
+        </w:tc>
+      </w:tr>
+      <w:tr>
+        <w:trPr>
+          <w:trHeight w:val="283"/>
+        </w:trPr>
+        <w:tc>
+          <w:tcPr>
+            <w:tcW w:w="5339" w:type="dxa"/>
+            <w:gridSpan w:val="10"/>
+            <w:tcBorders>
+              <w:top w:val="nil"/>
+              <w:left w:val="single" w:sz="4" w:space="0" w:color="000000"/>
+              <w:bottom w:val="nil"/>
+              <w:right w:val="nil"/>
+            </w:tcBorders>
+          </w:tcPr>
+          <w:p>
+            <w:r>
+              <w:rPr>
+                <w:sz w:val="24"/>
+              </w:rPr>
+              <w:t xml:space="preserve"> </w:t>
+            </w:r>
+          </w:p>
+        </w:tc>
+        <w:tc>
+          <w:tcPr>
+            <w:tcW w:w="1451" w:type="dxa"/>
+            <w:tcBorders>
+              <w:top w:val="nil"/>
+              <w:left w:val="nil"/>
+              <w:bottom w:val="nil"/>
+              <w:right w:val="single" w:sz="4" w:space="0" w:color="000000"/>
+            </w:tcBorders>
+          </w:tcPr>
+          <w:p>
+            <w:pPr>
+              <w:jc w:val="center"/>
+            </w:pPr>
+            <w:proofErr w:type="spellStart"/>
+            <w:r>
+              <w:rPr>
+                <w:b/>
+                <w:sz w:val="24"/>
+              </w:rPr>
+              <w:t>Averbação</w:t>
+            </w:r>
+            <w:proofErr w:type="spellEnd"/>
+          </w:p>
+        </w:tc>
+        <w:tc>
+          <w:tcPr>
+            <w:tcW w:w="3291" w:type="dxa"/>
+            <w:gridSpan w:val="7"/>
+            <w:tcBorders>
+              <w:top w:val="single" w:sz="4" w:space="0" w:color="000000"/>
+              <w:left w:val="single" w:sz="4" w:space="0" w:color="000000"/>
+              <w:bottom w:val="single" w:sz="4" w:space="0" w:color="000000"/>
+              <w:right w:val="single" w:sz="4" w:space="0" w:color="000000"/>
+            </w:tcBorders>
+          </w:tcPr>
+          <w:p>
+            <w:pPr>
+              <w:jc w:val="center"/>
+            </w:pPr>
+            <w:r>
+              <w:rPr>
+                <w:sz w:val="24"/>
+              </w:rPr>
+              <w:t xml:space="preserve"> </w:t>
+            </w:r>
+          </w:p>
+        </w:tc>
+        <w:tc>
+          <w:tcPr>
+            <w:tcW w:w="800" w:type="dxa"/>
+            <w:gridSpan w:val="3"/>
+            <w:tcBorders>
+              <w:top w:val="nil"/>
+              <w:left w:val="single" w:sz="4" w:space="0" w:color="000000"/>
+              <w:bottom w:val="nil"/>
+              <w:right w:val="single" w:sz="4" w:space="0" w:color="000000"/>
+            </w:tcBorders>
+          </w:tcPr>
+          <w:p>
+            <w:pPr>
+              <w:jc w:val="center"/>
+            </w:pPr>
+            <w:r>
+              <w:rPr>
+                <w:sz w:val="24"/>
+              </w:rPr>
+              <w:t xml:space="preserve"> </w:t>
+            </w:r>
+          </w:p>
+        </w:tc>
+      </w:tr>
+      <w:tr>
+        <w:trPr>
+          <w:trHeight w:val="283"/>
+        </w:trPr>
+        <w:tc>
+          <w:tcPr>
+            <w:tcW w:w="10881" w:type="dxa"/>
+            <w:gridSpan w:val="21"/>
+            <w:tcBorders>
+              <w:top w:val="nil"/>
+              <w:left w:val="single" w:sz="4" w:space="0" w:color="000000"/>
+              <w:bottom w:val="nil"/>
+              <w:right w:val="single" w:sz="4" w:space="0" w:color="000000"/>
+            </w:tcBorders>
+          </w:tcPr>
+          <w:p>
+            <w:proofErr w:type="spellStart"/>
+            <w:r>
+              <w:rPr>
+                <w:b/>
+                <w:sz w:val="24"/>
+              </w:rPr>
+              <w:t>Outras</w:t>
+            </w:r>
+            <w:proofErr w:type="spellEnd"/>
+            <w:r>
+              <w:rPr>
+                <w:b/>
+                <w:sz w:val="24"/>
+              </w:rPr>
+              <w:t xml:space="preserve"> </w:t>
+            </w:r>
+            <w:proofErr w:type="spellStart"/>
+            <w:r>
+              <w:rPr>
+                <w:b/>
+                <w:sz w:val="24"/>
+              </w:rPr>
+              <w:t>observações</w:t>
+            </w:r>
+            <w:proofErr w:type="spellEnd"/>
+            <w:r>
+              <w:rPr>
+                <w:b/>
+                <w:sz w:val="24"/>
+              </w:rPr>
+              <w:t xml:space="preserve"> </w:t>
+            </w:r>
+            <w:proofErr w:type="spellStart"/>
+            <w:r>
+              <w:rPr>
+                <w:b/>
+                <w:sz w:val="24"/>
+              </w:rPr>
+              <w:t>documentadas</w:t>
+            </w:r>
+            <w:proofErr w:type="spellEnd"/>
+          </w:p>
+        </w:tc>
+      </w:tr>
+      <w:tr>
+        <w:trPr>
+          <w:trHeight w:val="680"/>
+        </w:trPr>
+        <w:tc>
+          <w:tcPr>
+            <w:tcW w:w="6790" w:type="dxa"/>
+            <w:gridSpan w:val="11"/>
+            <w:tcBorders>
+              <w:top w:val="nil"/>
+              <w:left w:val="single" w:sz="4" w:space="0" w:color="000000"/>
+              <w:bottom w:val="nil"/>
+              <w:right w:val="single" w:sz="4" w:space="0" w:color="000000"/>
+            </w:tcBorders>
+          </w:tcPr>
+          <w:p>
+            <w:r>
+              <w:rPr>
+                <w:b/>
+                <w:sz w:val="24"/>
+              </w:rPr>
+              <w:t xml:space="preserve"> </w:t>
+            </w:r>
+          </w:p>
+        </w:tc>
+        <w:tc>
+          <w:tcPr>
+            <w:tcW w:w="3291" w:type="dxa"/>
+            <w:gridSpan w:val="7"/>
+            <w:tcBorders>
+              <w:top w:val="single" w:sz="4" w:space="0" w:color="000000"/>
+              <w:left w:val="single" w:sz="4" w:space="0" w:color="000000"/>
+              <w:bottom w:val="single" w:sz="4" w:space="0" w:color="000000"/>
+              <w:right w:val="single" w:sz="4" w:space="0" w:color="000000"/>
+            </w:tcBorders>
+          </w:tcPr>
+          <w:p>
+            <w:r>
+              <w:rPr>
+                <w:sz w:val="24"/>
+              </w:rPr>
+              <w:t xml:space="preserve"> </w:t>
+            </w:r>
+          </w:p>
+        </w:tc>
+        <w:tc>
+          <w:tcPr>
+            <w:tcW w:w="800" w:type="dxa"/>
+            <w:gridSpan w:val="3"/>
+            <w:tcBorders>
+              <w:top w:val="nil"/>
+              <w:left w:val="single" w:sz="4" w:space="0" w:color="000000"/>
+              <w:bottom w:val="nil"/>
+              <w:right w:val="single" w:sz="4" w:space="0" w:color="000000"/>
+            </w:tcBorders>
+          </w:tcPr>
+          <w:p>
+            <w:r>
+              <w:rPr>
+                <w:sz w:val="24"/>
+              </w:rPr>
+              <w:t xml:space="preserve"> </w:t>
+            </w:r>
+          </w:p>
+        </w:tc>
+      </w:tr>
+      <w:tr>
+        <w:trPr>
+          <w:trHeight w:val="57"/>
+        </w:trPr>
+        <w:tc>
+          <w:tcPr>
+            <w:tcW w:w="10881" w:type="dxa"/>
+            <w:gridSpan w:val="21"/>
+            <w:tcBorders>
+              <w:top w:val="nil"/>
+              <w:left w:val="single" w:sz="4" w:space="0" w:color="000000"/>
+              <w:bottom w:val="single" w:sz="4" w:space="0" w:color="000000"/>
+              <w:right w:val="single" w:sz="4" w:space="0" w:color="000000"/>
+            </w:tcBorders>
+          </w:tcPr>
+          <w:p>
+            <w:r>
+              <w:rPr>
+                <w:sz w:val="2"/>
+              </w:rPr>
+              <w:t xml:space="preserve"> </w:t>
+            </w:r>
+          </w:p>
+        </w:tc>
+      </w:tr>
     </w:tbl>
     <w:p>
+      <w:r>
+        <w:rPr>
+          <w:rFonts w:ascii="Calibri" w:hAnsi="Calibri"/>
+          <w:sz w:val="2"/>
+        </w:rPr>
+        <w:t>w</w:t>
+      </w:r>
+    </w:p>
+    <w:tbl>
+      <w:tblPr>
+        <w:tblStyle w:val="Tabelacomgrade"/>
+        <w:tblW w:w="0" w:type="auto"/>
+        <w:tblLook w:val="04A0" w:firstRow="1" w:lastRow="0" w:firstColumn="1" w:lastColumn="0" w:noHBand="0" w:noVBand="1"/>
+      </w:tblPr>
+      <w:tblGrid>
+        <w:gridCol w:w="2802"/>
+        <w:gridCol w:w="331"/>
+        <w:gridCol w:w="991"/>
+        <w:gridCol w:w="989"/>
+        <w:gridCol w:w="988"/>
+        <w:gridCol w:w="1662"/>
+        <w:gridCol w:w="307"/>
+        <w:gridCol w:w="982"/>
+        <w:gridCol w:w="982"/>
+        <w:gridCol w:w="847"/>
+      </w:tblGrid>
+      <w:tr>
+        <w:trPr>
+          <w:trHeight w:val="283"/>
+        </w:trPr>
+        <w:tc>
+          <w:tcPr>
+            <w:tcW w:w="10881" w:type="dxa"/>
+            <w:gridSpan w:val="10"/>
+            <w:tcBorders>
+              <w:top w:val="single" w:sz="4" w:space="0" w:color="000000"/>
+              <w:left w:val="single" w:sz="4" w:space="0" w:color="000000"/>
+              <w:bottom w:val="nil"/>
+              <w:right w:val="single" w:sz="4" w:space="0" w:color="000000"/>
+            </w:tcBorders>
+          </w:tcPr>
+          <w:p>
+            <w:pPr>
+              <w:jc w:val="center"/>
+            </w:pPr>
+            <w:proofErr w:type="spellStart"/>
+            <w:r>
+              <w:rPr>
+                <w:b/>
+                <w:sz w:val="24"/>
+              </w:rPr>
+              <w:t>Bioma</w:t>
+            </w:r>
+            <w:proofErr w:type="spellEnd"/>
+            <w:r>
+              <w:rPr>
+                <w:b/>
+                <w:sz w:val="24"/>
+              </w:rPr>
+              <w:t xml:space="preserve"> no </w:t>
+            </w:r>
+            <w:proofErr w:type="spellStart"/>
+            <w:r>
+              <w:rPr>
+                <w:b/>
+                <w:sz w:val="24"/>
+              </w:rPr>
+              <w:t>qual</w:t>
+            </w:r>
+            <w:proofErr w:type="spellEnd"/>
+            <w:r>
+              <w:rPr>
+                <w:b/>
+                <w:sz w:val="24"/>
+              </w:rPr>
+              <w:t xml:space="preserve"> a </w:t>
+            </w:r>
+            <w:proofErr w:type="spellStart"/>
+            <w:r>
+              <w:rPr>
+                <w:b/>
+                <w:sz w:val="24"/>
+              </w:rPr>
+              <w:t>propriedade</w:t>
+            </w:r>
+            <w:proofErr w:type="spellEnd"/>
+            <w:r>
+              <w:rPr>
+                <w:b/>
+                <w:sz w:val="24"/>
+              </w:rPr>
+              <w:t xml:space="preserve"> </w:t>
+            </w:r>
+            <w:proofErr w:type="spellStart"/>
+            <w:r>
+              <w:rPr>
+                <w:b/>
+                <w:sz w:val="24"/>
+              </w:rPr>
+              <w:t>está</w:t>
+            </w:r>
+            <w:proofErr w:type="spellEnd"/>
+            <w:r>
+              <w:rPr>
+                <w:b/>
+                <w:sz w:val="24"/>
+              </w:rPr>
+              <w:t xml:space="preserve"> </w:t>
+            </w:r>
+            <w:proofErr w:type="spellStart"/>
+            <w:r>
+              <w:rPr>
+                <w:b/>
+                <w:sz w:val="24"/>
+              </w:rPr>
+              <w:t>inserida</w:t>
+            </w:r>
+            <w:proofErr w:type="spellEnd"/>
+          </w:p>
+        </w:tc>
+      </w:tr>
+      <w:tr>
+        <w:trPr>
+          <w:trHeight w:val="283"/>
+        </w:trPr>
+        <w:tc>
+          <w:tcPr>
+            <w:tcW w:w="2802" w:type="dxa"/>
+            <w:tcBorders>
+              <w:top w:val="nil"/>
+              <w:left w:val="single" w:sz="4" w:space="0" w:color="000000"/>
+              <w:bottom w:val="nil"/>
+              <w:right w:val="single" w:sz="4" w:space="0" w:color="000000"/>
+            </w:tcBorders>
+          </w:tcPr>
+          <w:p>
+            <w:pPr>
+              <w:jc w:val="center"/>
+            </w:pPr>
+            <w:r>
+              <w:rPr>
+                <w:sz w:val="24"/>
+              </w:rPr>
+              <w:t>Amazônia</w:t>
+            </w:r>
+          </w:p>
+        </w:tc>
+        <w:tc>
+          <w:tcPr>
+            <w:tcW w:w="331" w:type="dxa"/>
+            <w:tcBorders>
+              <w:top w:val="single" w:sz="4" w:space="0" w:color="000000"/>
+              <w:left w:val="single" w:sz="4" w:space="0" w:color="000000"/>
+              <w:bottom w:val="single" w:sz="4" w:space="0" w:color="000000"/>
+              <w:right w:val="single" w:sz="4" w:space="0" w:color="000000"/>
+            </w:tcBorders>
+          </w:tcPr>
+          <w:p>
+            <w:pPr>
+              <w:jc w:val="center"/>
+            </w:pPr>
+            <w:r>
+              <w:rPr>
+                <w:sz w:val="24"/>
+              </w:rPr>
+              <w:t xml:space="preserve"> </w:t>
+            </w:r>
+          </w:p>
+        </w:tc>
+        <w:tc>
+          <w:tcPr>
+            <w:tcW w:w="4630" w:type="dxa"/>
+            <w:gridSpan w:val="4"/>
+            <w:tcBorders>
+              <w:top w:val="nil"/>
+              <w:left w:val="single" w:sz="4" w:space="0" w:color="000000"/>
+              <w:bottom w:val="nil"/>
+              <w:right w:val="single" w:sz="4" w:space="0" w:color="000000"/>
+            </w:tcBorders>
+          </w:tcPr>
+          <w:p>
+            <w:pPr>
+              <w:jc w:val="right"/>
+            </w:pPr>
+            <w:r>
+              <w:rPr>
+                <w:sz w:val="24"/>
+              </w:rPr>
+              <w:t>Pampa</w:t>
+            </w:r>
+          </w:p>
+        </w:tc>
+        <w:tc>
+          <w:tcPr>
+            <w:tcW w:w="307" w:type="dxa"/>
+            <w:tcBorders>
+              <w:top w:val="single" w:sz="4" w:space="0" w:color="000000"/>
+              <w:left w:val="single" w:sz="4" w:space="0" w:color="000000"/>
+              <w:bottom w:val="single" w:sz="4" w:space="0" w:color="000000"/>
+              <w:right w:val="single" w:sz="4" w:space="0" w:color="000000"/>
+            </w:tcBorders>
+          </w:tcPr>
+          <w:p>
+            <w:pPr>
+              <w:jc w:val="center"/>
+            </w:pPr>
+            <w:r>
+              <w:rPr>
+                <w:sz w:val="24"/>
+              </w:rPr>
+              <w:t xml:space="preserve"> </w:t>
+            </w:r>
+          </w:p>
+        </w:tc>
+        <w:tc>
+          <w:tcPr>
+            <w:tcW w:w="2811" w:type="dxa"/>
+            <w:gridSpan w:val="3"/>
+            <w:tcBorders>
+              <w:top w:val="nil"/>
+              <w:left w:val="single" w:sz="4" w:space="0" w:color="000000"/>
+              <w:bottom w:val="nil"/>
+              <w:right w:val="single" w:sz="4" w:space="0" w:color="000000"/>
+            </w:tcBorders>
+          </w:tcPr>
+          <w:p>
+            <w:pPr>
+              <w:jc w:val="center"/>
+            </w:pPr>
+            <w:r>
+              <w:rPr>
+                <w:sz w:val="24"/>
+              </w:rPr>
+              <w:t xml:space="preserve"> </w:t>
+            </w:r>
+          </w:p>
+        </w:tc>
+      </w:tr>
+      <w:tr>
+        <w:trPr>
+          <w:trHeight w:val="57"/>
+        </w:trPr>
+        <w:tc>
+          <w:tcPr>
+            <w:tcW w:w="10881" w:type="dxa"/>
+            <w:gridSpan w:val="10"/>
+            <w:tcBorders>
+              <w:top w:val="nil"/>
+              <w:left w:val="single" w:sz="4" w:space="0" w:color="000000"/>
+              <w:bottom w:val="nil"/>
+              <w:right w:val="single" w:sz="4" w:space="0" w:color="000000"/>
+            </w:tcBorders>
+          </w:tcPr>
+          <w:p>
+            <w:pPr>
+              <w:rPr>
+                <w:sz w:val="2"/>
+                <w:szCs w:val="2"/>
+              </w:rPr>
+            </w:pPr>
+            <w:r>
+              <w:rPr>
+                <w:sz w:val="2"/>
+                <w:szCs w:val="2"/>
+              </w:rPr>
+              <w:t xml:space="preserve"> </w:t>
+            </w:r>
+          </w:p>
+        </w:tc>
+      </w:tr>
+      <w:tr>
+        <w:trPr>
+          <w:trHeight w:val="283"/>
+        </w:trPr>
+        <w:tc>
+          <w:tcPr>
+            <w:tcW w:w="2802" w:type="dxa"/>
+            <w:tcBorders>
+              <w:top w:val="nil"/>
+              <w:left w:val="single" w:sz="4" w:space="0" w:color="000000"/>
+              <w:bottom w:val="nil"/>
+              <w:right w:val="single" w:sz="4" w:space="0" w:color="000000"/>
+            </w:tcBorders>
+          </w:tcPr>
+          <w:p>
+            <w:pPr>
+              <w:jc w:val="center"/>
+            </w:pPr>
+            <w:proofErr w:type="spellStart"/>
+            <w:r>
+              <w:rPr>
+                <w:sz w:val="24"/>
+              </w:rPr>
+              <w:t>Cerrado</w:t>
+            </w:r>
+            <w:proofErr w:type="spellEnd"/>
+          </w:p>
+        </w:tc>
+        <w:tc>
+          <w:tcPr>
+            <w:tcW w:w="331" w:type="dxa"/>
+            <w:tcBorders>
+              <w:top w:val="single" w:sz="4" w:space="0" w:color="000000"/>
+              <w:left w:val="single" w:sz="4" w:space="0" w:color="000000"/>
+              <w:bottom w:val="single" w:sz="4" w:space="0" w:color="000000"/>
+              <w:right w:val="single" w:sz="4" w:space="0" w:color="000000"/>
+            </w:tcBorders>
+          </w:tcPr>
+          <w:p>
+            <w:pPr>
+              <w:jc w:val="center"/>
+            </w:pPr>
+            <w:r>
+              <w:rPr>
+                <w:sz w:val="24"/>
+              </w:rPr>
+              <w:t xml:space="preserve"> </w:t>
+            </w:r>
+          </w:p>
+        </w:tc>
+        <w:tc>
+          <w:tcPr>
+            <w:tcW w:w="4630" w:type="dxa"/>
+            <w:gridSpan w:val="4"/>
+            <w:tcBorders>
+              <w:top w:val="nil"/>
+              <w:left w:val="single" w:sz="4" w:space="0" w:color="000000"/>
+              <w:bottom w:val="nil"/>
+              <w:right w:val="single" w:sz="4" w:space="0" w:color="000000"/>
+            </w:tcBorders>
+          </w:tcPr>
+          <w:p>
+            <w:pPr>
+              <w:jc w:val="right"/>
+            </w:pPr>
+            <w:r>
+              <w:rPr>
+                <w:sz w:val="24"/>
+              </w:rPr>
+              <w:t>Pantanal</w:t>
+            </w:r>
+          </w:p>
+        </w:tc>
+        <w:tc>
+          <w:tcPr>
+            <w:tcW w:w="307" w:type="dxa"/>
+            <w:tcBorders>
+              <w:top w:val="single" w:sz="4" w:space="0" w:color="000000"/>
+              <w:left w:val="single" w:sz="4" w:space="0" w:color="000000"/>
+              <w:bottom w:val="single" w:sz="4" w:space="0" w:color="000000"/>
+              <w:right w:val="single" w:sz="4" w:space="0" w:color="000000"/>
+            </w:tcBorders>
+          </w:tcPr>
+          <w:p>
+            <w:pPr>
+              <w:jc w:val="center"/>
+            </w:pPr>
+            <w:r>
+              <w:rPr>
+                <w:sz w:val="24"/>
+              </w:rPr>
+              <w:t xml:space="preserve"> </w:t>
+            </w:r>
+          </w:p>
+        </w:tc>
+        <w:tc>
+          <w:tcPr>
+            <w:tcW w:w="2811" w:type="dxa"/>
+            <w:gridSpan w:val="3"/>
+            <w:tcBorders>
+              <w:top w:val="nil"/>
+              <w:left w:val="single" w:sz="4" w:space="0" w:color="000000"/>
+              <w:bottom w:val="nil"/>
+              <w:right w:val="single" w:sz="4" w:space="0" w:color="000000"/>
+            </w:tcBorders>
+          </w:tcPr>
+          <w:p>
+            <w:pPr>
+              <w:jc w:val="center"/>
+            </w:pPr>
+            <w:r>
+              <w:rPr>
+                <w:sz w:val="24"/>
+              </w:rPr>
+              <w:t xml:space="preserve"> </w:t>
+            </w:r>
+          </w:p>
+        </w:tc>
+      </w:tr>
+      <w:tr>
+        <w:trPr>
+          <w:trHeight w:val="57"/>
+        </w:trPr>
+        <w:tc>
+          <w:tcPr>
+            <w:tcW w:w="2802" w:type="dxa"/>
+          </w:tcPr>
+          <w:p/>
+        </w:tc>
+        <w:tc>
+          <w:tcPr>
+            <w:tcW w:w="331" w:type="dxa"/>
+          </w:tcPr>
+          <w:p/>
+        </w:tc>
+        <w:tc>
+          <w:tcPr>
+            <w:tcW w:w="991" w:type="dxa"/>
+          </w:tcPr>
+          <w:p/>
+        </w:tc>
+        <w:tc>
+          <w:tcPr>
+            <w:tcW w:w="989" w:type="dxa"/>
+          </w:tcPr>
+          <w:p/>
+        </w:tc>
+        <w:tc>
+          <w:tcPr>
+            <w:tcW w:w="988" w:type="dxa"/>
+          </w:tcPr>
+          <w:p/>
+        </w:tc>
+        <w:tc>
+          <w:tcPr>
+            <w:tcW w:w="1662" w:type="dxa"/>
+          </w:tcPr>
+          <w:p/>
+        </w:tc>
+        <w:tc>
+          <w:tcPr>
+            <w:tcW w:w="307" w:type="dxa"/>
+          </w:tcPr>
+          <w:p/>
+        </w:tc>
+        <w:tc>
+          <w:tcPr>
+            <w:tcW w:w="982" w:type="dxa"/>
+          </w:tcPr>
+          <w:p/>
+        </w:tc>
+        <w:tc>
+          <w:tcPr>
+            <w:tcW w:w="982" w:type="dxa"/>
+          </w:tcPr>
+          <w:p/>
+        </w:tc>
+        <w:tc>
+          <w:tcPr>
+            <w:tcW w:w="847" w:type="dxa"/>
+          </w:tcPr>
+          <w:p/>
+        </w:tc>
+      </w:tr>
+      <w:tr>
+        <w:trPr>
+          <w:trHeight w:val="283"/>
+        </w:trPr>
+        <w:tc>
+          <w:tcPr>
+            <w:tcW w:w="2802" w:type="dxa"/>
+          </w:tcPr>
+          <w:p/>
+        </w:tc>
+        <w:tc>
+          <w:tcPr>
+            <w:tcW w:w="331" w:type="dxa"/>
+          </w:tcPr>
+          <w:p/>
+        </w:tc>
+        <w:tc>
+          <w:tcPr>
+            <w:tcW w:w="991" w:type="dxa"/>
+          </w:tcPr>
+          <w:p/>
+        </w:tc>
+        <w:tc>
+          <w:tcPr>
+            <w:tcW w:w="989" w:type="dxa"/>
+          </w:tcPr>
+          <w:p/>
+        </w:tc>
+        <w:tc>
+          <w:tcPr>
+            <w:tcW w:w="988" w:type="dxa"/>
+          </w:tcPr>
+          <w:p/>
+        </w:tc>
+        <w:tc>
+          <w:tcPr>
+            <w:tcW w:w="1662" w:type="dxa"/>
+          </w:tcPr>
+          <w:p/>
+        </w:tc>
+        <w:tc>
+          <w:tcPr>
+            <w:tcW w:w="307" w:type="dxa"/>
+          </w:tcPr>
+          <w:p/>
+        </w:tc>
+        <w:tc>
+          <w:tcPr>
+            <w:tcW w:w="982" w:type="dxa"/>
+          </w:tcPr>
+          <w:p/>
+        </w:tc>
+        <w:tc>
+          <w:tcPr>
+            <w:tcW w:w="982" w:type="dxa"/>
+          </w:tcPr>
+          <w:p/>
+        </w:tc>
+        <w:tc>
+          <w:tcPr>
+            <w:tcW w:w="847" w:type="dxa"/>
+          </w:tcPr>
+          <w:p/>
+        </w:tc>
+      </w:tr>
+      <w:tr>
+        <w:trPr>
+          <w:trHeight w:val="57"/>
+        </w:trPr>
+        <w:tc>
+          <w:tcPr>
+            <w:tcW w:w="2802" w:type="dxa"/>
+          </w:tcPr>
+          <w:p/>
+        </w:tc>
+        <w:tc>
+          <w:tcPr>
+            <w:tcW w:w="331" w:type="dxa"/>
+          </w:tcPr>
+          <w:p/>
+        </w:tc>
+        <w:tc>
+          <w:tcPr>
+            <w:tcW w:w="991" w:type="dxa"/>
+          </w:tcPr>
+          <w:p/>
+        </w:tc>
+        <w:tc>
+          <w:tcPr>
+            <w:tcW w:w="989" w:type="dxa"/>
+          </w:tcPr>
+          <w:p/>
+        </w:tc>
+        <w:tc>
+          <w:tcPr>
+            <w:tcW w:w="988" w:type="dxa"/>
+          </w:tcPr>
+          <w:p/>
+        </w:tc>
+        <w:tc>
+          <w:tcPr>
+            <w:tcW w:w="1662" w:type="dxa"/>
+          </w:tcPr>
+          <w:p/>
+        </w:tc>
+        <w:tc>
+          <w:tcPr>
+            <w:tcW w:w="307" w:type="dxa"/>
+          </w:tcPr>
+          <w:p/>
+        </w:tc>
+        <w:tc>
+          <w:tcPr>
+            <w:tcW w:w="982" w:type="dxa"/>
+          </w:tcPr>
+          <w:p/>
+        </w:tc>
+        <w:tc>
+          <w:tcPr>
+            <w:tcW w:w="982" w:type="dxa"/>
+          </w:tcPr>
+          <w:p/>
+        </w:tc>
+        <w:tc>
+          <w:tcPr>
+            <w:tcW w:w="847" w:type="dxa"/>
+          </w:tcPr>
+          <w:p/>
+        </w:tc>
+      </w:tr>
+    </w:tbl>
+    <w:p>
+      <w:r>
+        <w:br w:type="page"/>
+      </w:r>
       <w:r>
         <w:rPr>
           <w:noProof/>
@@ -14016,7 +15572,7 @@
 </file>
 
 <file path=customXml/itemProps1.xml><?xml version="1.0" encoding="utf-8"?>
-<ds:datastoreItem xmlns:ds="http://schemas.openxmlformats.org/officeDocument/2006/customXml" ds:itemID="{96AACE53-BCE1-45C0-B158-427D9D4974EB}">
+<ds:datastoreItem xmlns:ds="http://schemas.openxmlformats.org/officeDocument/2006/customXml" ds:itemID="{D129D8EC-2A43-4FA0-88A1-D0D9396D40EF}">
   <ds:schemaRefs>
     <ds:schemaRef ds:uri="http://schemas.openxmlformats.org/officeDocument/2006/bibliography"/>
   </ds:schemaRefs>

</xml_diff>